<commit_message>
Completed Sections 1-5 of Interim Report
</commit_message>
<xml_diff>
--- a/09_reports/interim_report_draft.docx
+++ b/09_reports/interim_report_draft.docx
@@ -4,10 +4,10 @@
   <w:body>
     <w:p>
       <w:r>
-        <w:t xml:space="preserve">Paper 1 </w:t>
-      </w:r>
-      <w:r>
-        <w:t>—</w:t>
+        <w:t>Paper 1</w:t>
+      </w:r>
+      <w:r>
+        <w:t xml:space="preserve"> -</w:t>
       </w:r>
       <w:r>
         <w:t xml:space="preserve"> </w:t>
@@ -38,95 +38,69 @@
       </w:r>
     </w:p>
     <w:p>
-      <w:r>
-        <w:t>Paragraph 1 — what they studied, what data they used, what method they used (~75 words)</w:t>
-      </w:r>
-    </w:p>
-    <w:p>
-      <w:r>
-        <w:fldChar w:fldCharType="begin"/>
-      </w:r>
-      <w:r>
-        <w:instrText xml:space="preserve"> ADDIN ZOTERO_ITEM CSL_CITATION {"citationID":"rAAmpFz9","properties":{"unsorted":false,"formattedCitation":"(Tsiara and Tjortjis, 2020)","plainCitation":"(Tsiara and Tjortjis, 2020)","noteIndex":0},"citationItems":[{"id":1,"uris":["http://zotero.org/users/19775133/items/IB4ZH9BP"],"itemData":{"id":1,"type":"paper-conference","abstract":"With the advent of social media, concepts such as forecasting and now casting became part of the public debate. Past successes include predicting election results, stock prices and forecasting events or behaviors. This work aims at using Twitter data, related to songs and artists that appeared on the top 10 of the Billboard Hot 100 charts, performing sentiment analysis on the collected tweets, to predict the charts in the future. Our goal was to investigate the relation between the number of mentions of a song and its artist, as well as the semantic orientation of the relevant posts and its performance on the subsequent chart. The problem was approached via regression analysis, which estimated the difference between the actual and predicted positions and moderated results. We also focused on forecasting chart ranges, namely the top 5, 10 and 20. Given the accuracy and F-score achieved compared to previous research, our findings are deemed satisfactory, especially in predicting the top 20.","container-title":"Artificial Intelligence Applications and Innovations","ISBN":"978-3-030-49161-1","page":"62–72","publisher":"Springer International Publishing","publisher-place":"Cham","title":"Using Twitter to Predict Chart Position for Songs","author":[{"family":"Tsiara","given":"Eleana"},{"family":"Tjortjis","given":"Christos"}],"editor":[{"family":"Maglogiannis","given":"Ilias"},{"family":"Iliadis","given":"Lazaros"},{"family":"Pimenidis","given":"Elias"}],"issued":{"date-parts":[["2020"]]}}}],"schema":"https://github.com/citation-style-language/schema/raw/master/csl-citation.json"} </w:instrText>
-      </w:r>
-      <w:r>
-        <w:fldChar w:fldCharType="separate"/>
-      </w:r>
+      <w:proofErr w:type="spellStart"/>
       <w:r>
         <w:rPr>
           <w:rFonts w:ascii="Aptos" w:hAnsi="Aptos"/>
         </w:rPr>
-        <w:t>(Tsiara and Tjortjis, 2020)</w:t>
+        <w:t>Tsiara</w:t>
+      </w:r>
+      <w:proofErr w:type="spellEnd"/>
+      <w:r>
+        <w:rPr>
+          <w:rFonts w:ascii="Aptos" w:hAnsi="Aptos"/>
+        </w:rPr>
+        <w:t xml:space="preserve"> and </w:t>
+      </w:r>
+      <w:proofErr w:type="spellStart"/>
+      <w:r>
+        <w:rPr>
+          <w:rFonts w:ascii="Aptos" w:hAnsi="Aptos"/>
+        </w:rPr>
+        <w:t>Tjortjis</w:t>
+      </w:r>
+      <w:proofErr w:type="spellEnd"/>
+      <w:r>
+        <w:t xml:space="preserve">  </w:t>
+      </w:r>
+      <w:r>
+        <w:fldChar w:fldCharType="begin"/>
+      </w:r>
+      <w:r>
+        <w:instrText xml:space="preserve"> ADDIN ZOTERO_ITEM CSL_CITATION {"citationID":"I5EOz71B","properties":{"unsorted":false,"formattedCitation":"(2020)","plainCitation":"(2020)","noteIndex":0},"citationItems":[{"id":1,"uris":["http://zotero.org/users/19775133/items/IB4ZH9BP"],"itemData":{"id":1,"type":"paper-conference","abstract":"With the advent of social media, concepts such as forecasting and now casting became part of the public debate. Past successes include predicting election results, stock prices and forecasting events or behaviors. This work aims at using Twitter data, related to songs and artists that appeared on the top 10 of the Billboard Hot 100 charts, performing sentiment analysis on the collected tweets, to predict the charts in the future. Our goal was to investigate the relation between the number of mentions of a song and its artist, as well as the semantic orientation of the relevant posts and its performance on the subsequent chart. The problem was approached via regression analysis, which estimated the difference between the actual and predicted positions and moderated results. We also focused on forecasting chart ranges, namely the top 5, 10 and 20. Given the accuracy and F-score achieved compared to previous research, our findings are deemed satisfactory, especially in predicting the top 20.","container-title":"Artificial Intelligence Applications and Innovations","ISBN":"978-3-030-49161-1","page":"62–72","publisher":"Springer International Publishing","publisher-place":"Cham","title":"Using Twitter to Predict Chart Position for Songs","author":[{"family":"Tsiara","given":"Eleana"},{"family":"Tjortjis","given":"Christos"}],"editor":[{"family":"Maglogiannis","given":"Ilias"},{"family":"Iliadis","given":"Lazaros"},{"family":"Pimenidis","given":"Elias"}],"issued":{"date-parts":[["2020"]]}},"suppress-author":true}],"schema":"https://github.com/citation-style-language/schema/raw/master/csl-citation.json"} </w:instrText>
+      </w:r>
+      <w:r>
+        <w:fldChar w:fldCharType="separate"/>
+      </w:r>
+      <w:r>
+        <w:rPr>
+          <w:rFonts w:ascii="Aptos" w:hAnsi="Aptos"/>
+        </w:rPr>
+        <w:t>(2020)</w:t>
       </w:r>
       <w:r>
         <w:fldChar w:fldCharType="end"/>
       </w:r>
       <w:r>
-        <w:t xml:space="preserve"> </w:t>
-      </w:r>
-      <w:r>
-        <w:t>examined the correlation between the number of mentions of a song and its artist, as well as the number of positive, negative, and neutral posts on Twitter, and the song's chart performance. Data</w:t>
-      </w:r>
-      <w:r>
-        <w:t>,</w:t>
-      </w:r>
-      <w:r>
-        <w:t xml:space="preserve"> </w:t>
-      </w:r>
-      <w:r>
-        <w:t>such as</w:t>
-      </w:r>
-      <w:r>
-        <w:t xml:space="preserve"> </w:t>
-      </w:r>
-      <w:r>
-        <w:t>a</w:t>
-      </w:r>
-      <w:r>
-        <w:t>rtist name, song title and rank were collected from the official Billboard Hot 100 chart website and extracted into a .json and .csv file</w:t>
-      </w:r>
-      <w:r>
-        <w:t>, while</w:t>
-      </w:r>
-      <w:r>
-        <w:t xml:space="preserve"> </w:t>
-      </w:r>
-      <w:r>
-        <w:t xml:space="preserve">relevant Twitter posts were collected using </w:t>
-      </w:r>
-      <w:r>
-        <w:t>Twitter Searc</w:t>
-      </w:r>
-      <w:r>
-        <w:t>h API</w:t>
-      </w:r>
-      <w:r>
-        <w:t>. A regression analysis algorithm was used to estimate the difference between the real and projected position and the controlled results.</w:t>
-      </w:r>
-    </w:p>
-    <w:p/>
-    <w:p>
-      <w:r>
-        <w:t>Paragraph 2 — what they found, and one sentence explaining why this is relevant to your project (~75 words)</w:t>
+        <w:t xml:space="preserve"> examined the correlation between the number of mentions of a song and its artist, as well as the number of positive, negative, and neutral posts on Twitter, and the song's chart performance. Data, such as artist name, song title and rank were collected from the official Billboard Hot 100 chart website and extracted into a .</w:t>
+      </w:r>
+      <w:proofErr w:type="spellStart"/>
+      <w:r>
+        <w:t>json</w:t>
+      </w:r>
+      <w:proofErr w:type="spellEnd"/>
+      <w:r>
+        <w:t xml:space="preserve"> and .csv file, while relevant Twitter posts were collected using Twitter Search API. A regression analysis algorithm was used to estimate the difference between the real and projected position and the controlled results.</w:t>
       </w:r>
     </w:p>
     <w:p>
       <w:r>
-        <w:t>The study found a moderate correlation of 0.2917 between song mentions and chart performance</w:t>
-      </w:r>
-      <w:r>
-        <w:t>, whereas</w:t>
-      </w:r>
-      <w:r>
-        <w:t xml:space="preserve"> the correlation between artist mentions and their success yielded insignificant results.</w:t>
+        <w:t>The study found a moderate correlation of 0.2917 between song mentions and chart performance, whereas the correlation between artist mentions and their success yielded insignificant results.</w:t>
       </w:r>
     </w:p>
     <w:p>
       <w:r>
-        <w:t>This study shows that social media sentiment can affect the performance of a song which is relevant to my own project which will examine the correlation between social media sentiment and K-pop groups comeback performance</w:t>
-      </w:r>
-      <w:r>
-        <w:t xml:space="preserve"> on YouTube, analysing views, likes and comments.</w:t>
+        <w:t>This study shows that social media sentiment can affect the performance of a song which is relevant to my own project which will examine the correlation between social media sentiment and K-pop groups comeback performance on YouTube, analysing views, likes and comments.</w:t>
       </w:r>
     </w:p>
     <w:p>
@@ -137,25 +111,19 @@
     <w:p>
       <w:r>
         <w:lastRenderedPageBreak/>
-        <w:t xml:space="preserve">Paper </w:t>
-      </w:r>
-      <w:r>
-        <w:t>2</w:t>
-      </w:r>
-      <w:r>
-        <w:t xml:space="preserve"> — </w:t>
-      </w:r>
-      <w:r>
-        <w:t>Comparative Analysis of Naïve Bayes Classifier and Support Vector Machine in Sentiment Analysis of Social Media Data</w:t>
-      </w:r>
-      <w:r>
-        <w:t xml:space="preserve"> </w:t>
+        <w:t xml:space="preserve">Paper 2 </w:t>
+      </w:r>
+      <w:r>
+        <w:t>-</w:t>
+      </w:r>
+      <w:r>
+        <w:t xml:space="preserve"> Comparative Analysis of Naïve Bayes Classifier and Support Vector Machine in Sentiment Analysis of Social Media Data </w:t>
       </w:r>
       <w:r>
         <w:fldChar w:fldCharType="begin"/>
       </w:r>
       <w:r>
-        <w:instrText xml:space="preserve"> ADDIN ZOTERO_ITEM CSL_CITATION {"citationID":"FS3o2nFs","properties":{"unsorted":false,"formattedCitation":"(Aprinastya {\\i{}et al.}, 2024)","plainCitation":"(Aprinastya et al., 2024)","noteIndex":0},"citationItems":[{"id":7,"uris":["http://zotero.org/users/19775133/items/R2UVRX8Z"],"itemData":{"id":7,"type":"article-journal","container-title":"JUSIFO (Jurnal Sistem Informasi)","ISSN":"2623-1662","issue":"2","journalAbbreviation":"JUSIFO (Jurnal Sistem Informasi)","page":"117-126","title":"Comparative Analysis of Naïve Bayes Classifier and Support Vector Machine for Multilingual Sentiment Analysis: Insights from Genshin Impact User Reviews","volume":"10","author":[{"family":"Aprinastya","given":"Rachell"},{"family":"Jazman","given":"Muhammad"},{"family":"Syaifullah","given":"Syaifullah"},{"family":"Rahmawita","given":"Medyantiwi"},{"family":"Siregar","given":"Syafril"},{"family":"Saputra","given":"Eki"}],"issued":{"date-parts":[["2024"]]}}}],"schema":"https://github.com/citation-style-language/schema/raw/master/csl-citation.json"} </w:instrText>
+        <w:instrText xml:space="preserve"> ADDIN ZOTERO_ITEM CSL_CITATION {"citationID":"hstH7Vow","properties":{"unsorted":false,"formattedCitation":"(Aprinastya {\\i{}et al.}, 2024)","plainCitation":"(Aprinastya et al., 2024)","noteIndex":0},"citationItems":[{"id":7,"uris":["http://zotero.org/users/19775133/items/R2UVRX8Z"],"itemData":{"id":7,"type":"article-journal","container-title":"JUSIFO (Jurnal Sistem Informasi)","ISSN":"2623-1662","issue":"2","journalAbbreviation":"JUSIFO (Jurnal Sistem Informasi)","page":"117-126","title":"Comparative Analysis of Naïve Bayes Classifier and Support Vector Machine for Multilingual Sentiment Analysis: Insights from Genshin Impact User Reviews","volume":"10","author":[{"family":"Aprinastya","given":"Rachell"},{"family":"Jazman","given":"Muhammad"},{"family":"Syaifullah","given":"Syaifullah"},{"family":"Rahmawita","given":"Medyantiwi"},{"family":"Siregar","given":"Syafril"},{"family":"Saputra","given":"Eki"}],"issued":{"date-parts":[["2024"]]}}}],"schema":"https://github.com/citation-style-language/schema/raw/master/csl-citation.json"} </w:instrText>
       </w:r>
       <w:r>
         <w:fldChar w:fldCharType="separate"/>
@@ -164,7 +132,21 @@
         <w:rPr>
           <w:rFonts w:ascii="Aptos" w:hAnsi="Aptos" w:cs="Times New Roman"/>
         </w:rPr>
-        <w:t xml:space="preserve">(Aprinastya </w:t>
+        <w:t>(</w:t>
+      </w:r>
+      <w:proofErr w:type="spellStart"/>
+      <w:r>
+        <w:rPr>
+          <w:rFonts w:ascii="Aptos" w:hAnsi="Aptos" w:cs="Times New Roman"/>
+        </w:rPr>
+        <w:t>Aprinastya</w:t>
+      </w:r>
+      <w:proofErr w:type="spellEnd"/>
+      <w:r>
+        <w:rPr>
+          <w:rFonts w:ascii="Aptos" w:hAnsi="Aptos" w:cs="Times New Roman"/>
+        </w:rPr>
+        <w:t xml:space="preserve"> </w:t>
       </w:r>
       <w:r>
         <w:rPr>
@@ -185,33 +167,13 @@
       </w:r>
     </w:p>
     <w:p>
-      <w:r>
-        <w:t>Paragraph 1 — what they studied, what data they used, what method they used (~75 words)</w:t>
-      </w:r>
-    </w:p>
-    <w:p/>
-    <w:p>
-      <w:r>
-        <w:t>Paragraph 2 — what they found, and one sentence explaining why this is relevant to your project (~75 words)</w:t>
-      </w:r>
-    </w:p>
-    <w:p>
-      <w:r>
-        <w:br w:type="page"/>
-      </w:r>
-    </w:p>
-    <w:p>
-      <w:r>
-        <w:t xml:space="preserve">Paper </w:t>
-      </w:r>
-      <w:r>
-        <w:t>3</w:t>
-      </w:r>
-      <w:r>
-        <w:t xml:space="preserve"> — </w:t>
-      </w:r>
-      <w:r>
-        <w:t>Comparison of Naïve Bayes Classifier and Support Vector Machine in Classifying Public Responses on Twitter</w:t>
+      <w:proofErr w:type="spellStart"/>
+      <w:r>
+        <w:t>Aprinastya</w:t>
+      </w:r>
+      <w:proofErr w:type="spellEnd"/>
+      <w:r>
+        <w:t xml:space="preserve"> et al.</w:t>
       </w:r>
       <w:r>
         <w:t xml:space="preserve"> </w:t>
@@ -220,7 +182,7 @@
         <w:fldChar w:fldCharType="begin"/>
       </w:r>
       <w:r>
-        <w:instrText xml:space="preserve"> ADDIN ZOTERO_ITEM CSL_CITATION {"citationID":"3skt4daz","properties":{"unsorted":false,"formattedCitation":"(Millennianita, Athiyah and Muhammad, 2024)","plainCitation":"(Millennianita, Athiyah and Muhammad, 2024)","noteIndex":0},"citationItems":[{"id":5,"uris":["http://zotero.org/users/19775133/items/ZXQYT8C9"],"itemData":{"id":5,"type":"article-journal","container-title":"Journal of Mechatronics and Artificial Intelligence","ISSN":"3048-4227","issue":"1","journalAbbreviation":"Journal of Mechatronics and Artificial Intelligence","page":"11-26","title":"Comparison of naive bayes classifier and support vector machine methods for sentiment classification of responses to bullying cases on Twitter","volume":"1","author":[{"family":"Millennianita","given":"Firda"},{"family":"Athiyah","given":"Ummi"},{"family":"Muhammad","given":"Arif Wirawan"}],"issued":{"date-parts":[["2024"]]}}}],"schema":"https://github.com/citation-style-language/schema/raw/master/csl-citation.json"} </w:instrText>
+        <w:instrText xml:space="preserve"> ADDIN ZOTERO_ITEM CSL_CITATION {"citationID":"46qG9wo5","properties":{"unsorted":false,"formattedCitation":"(2024)","plainCitation":"(2024)","noteIndex":0},"citationItems":[{"id":7,"uris":["http://zotero.org/users/19775133/items/R2UVRX8Z"],"itemData":{"id":7,"type":"article-journal","container-title":"JUSIFO (Jurnal Sistem Informasi)","ISSN":"2623-1662","issue":"2","journalAbbreviation":"JUSIFO (Jurnal Sistem Informasi)","page":"117-126","title":"Comparative Analysis of Naïve Bayes Classifier and Support Vector Machine for Multilingual Sentiment Analysis: Insights from Genshin Impact User Reviews","volume":"10","author":[{"family":"Aprinastya","given":"Rachell"},{"family":"Jazman","given":"Muhammad"},{"family":"Syaifullah","given":"Syaifullah"},{"family":"Rahmawita","given":"Medyantiwi"},{"family":"Siregar","given":"Syafril"},{"family":"Saputra","given":"Eki"}],"issued":{"date-parts":[["2024"]]}},"suppress-author":true}],"schema":"https://github.com/citation-style-language/schema/raw/master/csl-citation.json"} </w:instrText>
       </w:r>
       <w:r>
         <w:fldChar w:fldCharType="separate"/>
@@ -229,23 +191,187 @@
         <w:rPr>
           <w:rFonts w:ascii="Aptos" w:hAnsi="Aptos"/>
         </w:rPr>
-        <w:t>(Millennianita, Athiyah and Muhammad, 2024)</w:t>
+        <w:t>(2024)</w:t>
       </w:r>
       <w:r>
         <w:fldChar w:fldCharType="end"/>
+      </w:r>
+      <w:r>
+        <w:t xml:space="preserve"> examined the performance of the Naïve Bayes Classifier and Support Vector Machine algorithms in sentiment analysis of multilingual user reviews for the popular Genshin Impact game on Google Play Store and App Store. Preprocessing techniques such as tokenisation, stemming and TF-IDF (</w:t>
+      </w:r>
+      <w:r>
+        <w:t>Term</w:t>
+      </w:r>
+      <w:r>
+        <w:t xml:space="preserve"> Frequency-Inverse Document Frequency) were used to enhance the data quality. Classification was done using both NBC and SVM algorithms to carry out the final comparison for the sentiment analysis. </w:t>
       </w:r>
     </w:p>
     <w:p>
       <w:r>
-        <w:t>Paragraph 1 — what they studied, what data they used, what method they used (~75 words)</w:t>
+        <w:t xml:space="preserve">The study found that Naïve Bayes Classifier returns a better accuracy of 71%, while Support Vector Machine had an accuracy of 63%, making Naïve Bayes Classifier the ideal choice for multilingual sentiment analysis. </w:t>
+      </w:r>
+      <w:r>
+        <w:t>This study provides guidance on selecting the appropriate classification algorithm for this project. The comparison between NBC and SVM provides evidence for choosing the most accurate classifier when applied to English-language social media data collected from Twitter and Reddit.</w:t>
+      </w:r>
+      <w:r>
+        <w:br w:type="page"/>
+      </w:r>
+    </w:p>
+    <w:p>
+      <w:r>
+        <w:t xml:space="preserve">Paper 3 </w:t>
+      </w:r>
+      <w:r>
+        <w:t>-</w:t>
+      </w:r>
+      <w:r>
+        <w:t xml:space="preserve"> Comparison of Naïve Bayes Classifier and Support Vector Machine in Classifying Public Responses on Twitter </w:t>
+      </w:r>
+      <w:r>
+        <w:fldChar w:fldCharType="begin"/>
+      </w:r>
+      <w:r>
+        <w:instrText xml:space="preserve"> ADDIN ZOTERO_ITEM CSL_CITATION {"citationID":"OcVqpO20","properties":{"unsorted":false,"formattedCitation":"(Millennianita, Athiyah and Muhammad, 2024)","plainCitation":"(Millennianita, Athiyah and Muhammad, 2024)","noteIndex":0},"citationItems":[{"id":5,"uris":["http://zotero.org/users/19775133/items/ZXQYT8C9"],"itemData":{"id":5,"type":"article-journal","container-title":"Journal of Mechatronics and Artificial Intelligence","ISSN":"3048-4227","issue":"1","journalAbbreviation":"Journal of Mechatronics and Artificial Intelligence","page":"11-26","title":"Comparison of naive bayes classifier and support vector machine methods for sentiment classification of responses to bullying cases on Twitter","volume":"1","author":[{"family":"Millennianita","given":"Firda"},{"family":"Athiyah","given":"Ummi"},{"family":"Muhammad","given":"Arif Wirawan"}],"issued":{"date-parts":[["2024"]]}}}],"schema":"https://github.com/citation-style-language/schema/raw/master/csl-citation.json"} </w:instrText>
+      </w:r>
+      <w:r>
+        <w:fldChar w:fldCharType="separate"/>
+      </w:r>
+      <w:r>
+        <w:rPr>
+          <w:rFonts w:ascii="Aptos" w:hAnsi="Aptos"/>
+        </w:rPr>
+        <w:t>(</w:t>
+      </w:r>
+      <w:proofErr w:type="spellStart"/>
+      <w:r>
+        <w:rPr>
+          <w:rFonts w:ascii="Aptos" w:hAnsi="Aptos"/>
+        </w:rPr>
+        <w:t>Millennianita</w:t>
+      </w:r>
+      <w:proofErr w:type="spellEnd"/>
+      <w:r>
+        <w:rPr>
+          <w:rFonts w:ascii="Aptos" w:hAnsi="Aptos"/>
+        </w:rPr>
+        <w:t xml:space="preserve">, </w:t>
+      </w:r>
+      <w:proofErr w:type="spellStart"/>
+      <w:r>
+        <w:rPr>
+          <w:rFonts w:ascii="Aptos" w:hAnsi="Aptos"/>
+        </w:rPr>
+        <w:t>Athiyah</w:t>
+      </w:r>
+      <w:proofErr w:type="spellEnd"/>
+      <w:r>
+        <w:rPr>
+          <w:rFonts w:ascii="Aptos" w:hAnsi="Aptos"/>
+        </w:rPr>
+        <w:t xml:space="preserve"> and Muhammad, 2024)</w:t>
+      </w:r>
+      <w:r>
+        <w:fldChar w:fldCharType="end"/>
+      </w:r>
+    </w:p>
+    <w:p>
+      <w:proofErr w:type="spellStart"/>
+      <w:r>
+        <w:t>Millennianita</w:t>
+      </w:r>
+      <w:proofErr w:type="spellEnd"/>
+      <w:r>
+        <w:t xml:space="preserve">, </w:t>
+      </w:r>
+      <w:proofErr w:type="spellStart"/>
+      <w:r>
+        <w:t>Athiyah</w:t>
+      </w:r>
+      <w:proofErr w:type="spellEnd"/>
+      <w:r>
+        <w:t xml:space="preserve"> and Muhammad </w:t>
+      </w:r>
+      <w:r>
+        <w:fldChar w:fldCharType="begin"/>
+      </w:r>
+      <w:r>
+        <w:instrText xml:space="preserve"> ADDIN ZOTERO_ITEM CSL_CITATION {"citationID":"Wrt2rwgV","properties":{"unsorted":false,"formattedCitation":"(2024)","plainCitation":"(2024)","noteIndex":0},"citationItems":[{"id":5,"uris":["http://zotero.org/users/19775133/items/ZXQYT8C9"],"itemData":{"id":5,"type":"article-journal","container-title":"Journal of Mechatronics and Artificial Intelligence","ISSN":"3048-4227","issue":"1","journalAbbreviation":"Journal of Mechatronics and Artificial Intelligence","page":"11-26","title":"Comparison of naive bayes classifier and support vector machine methods for sentiment classification of responses to bullying cases on Twitter","volume":"1","author":[{"family":"Millennianita","given":"Firda"},{"family":"Athiyah","given":"Ummi"},{"family":"Muhammad","given":"Arif Wirawan"}],"issued":{"date-parts":[["2024"]]}},"suppress-author":true}],"schema":"https://github.com/citation-style-language/schema/raw/master/csl-citation.json"} </w:instrText>
+      </w:r>
+      <w:r>
+        <w:fldChar w:fldCharType="separate"/>
+      </w:r>
+      <w:r>
+        <w:rPr>
+          <w:rFonts w:ascii="Aptos" w:hAnsi="Aptos"/>
+        </w:rPr>
+        <w:t>(2024)</w:t>
+      </w:r>
+      <w:r>
+        <w:fldChar w:fldCharType="end"/>
+      </w:r>
+      <w:r>
+        <w:t xml:space="preserve"> examined the public sentiment of Indonesian fans on Twitter regarding the Kim Garam bullying accusation case. They collected Twitter data with the keywords ‘</w:t>
+      </w:r>
+      <w:proofErr w:type="spellStart"/>
+      <w:r>
+        <w:t>kim</w:t>
+      </w:r>
+      <w:proofErr w:type="spellEnd"/>
+      <w:r>
+        <w:t xml:space="preserve"> garam’, ‘bullying’, and ‘bullying case’ by extracting them using a Python web crawler in Google </w:t>
+      </w:r>
+      <w:proofErr w:type="spellStart"/>
+      <w:r>
+        <w:t>Colaboratory</w:t>
+      </w:r>
+      <w:proofErr w:type="spellEnd"/>
+      <w:r>
+        <w:t>, using ‘</w:t>
+      </w:r>
+      <w:proofErr w:type="spellStart"/>
+      <w:r>
+        <w:t>tweppy</w:t>
+      </w:r>
+      <w:proofErr w:type="spellEnd"/>
+      <w:r>
+        <w:t xml:space="preserve">’ and ‘Pandas’ libraries for accessing the Twitter API and data handling, respectively. The data was stored in a Microsoft Excel file and went through pre-processing steps, including cleaning, tokenisation and stemming. </w:t>
+      </w:r>
+    </w:p>
+    <w:p>
+      <w:r>
+        <w:t xml:space="preserve">The data was then subjected to feature selection using TF-IDF, followed by NBC and SVM for classification to determine which method performed better. The study found that the sentiment analysis result showed more positive comments on Twitter concerning the Kim Garam bullying accusation case. The Support Vector Machine algorithm outdid the Naïve Bayes Classifier algorithm with an accuracy score of 97% to 93%, placing the Support Vector Machine as the better algorithm for sentiment classification in this case The contrasting results between this study and </w:t>
+      </w:r>
+      <w:proofErr w:type="spellStart"/>
+      <w:r>
+        <w:t>Aprinastya</w:t>
+      </w:r>
+      <w:proofErr w:type="spellEnd"/>
+      <w:r>
+        <w:t xml:space="preserve"> et al. </w:t>
+      </w:r>
+      <w:r>
+        <w:fldChar w:fldCharType="begin"/>
+      </w:r>
+      <w:r>
+        <w:instrText xml:space="preserve"> ADDIN ZOTERO_ITEM CSL_CITATION {"citationID":"R5GGFDfq","properties":{"unsorted":false,"formattedCitation":"(2024)","plainCitation":"(2024)","noteIndex":0},"citationItems":[{"id":7,"uris":["http://zotero.org/users/19775133/items/R2UVRX8Z"],"itemData":{"id":7,"type":"article-journal","container-title":"JUSIFO (Jurnal Sistem Informasi)","ISSN":"2623-1662","issue":"2","journalAbbreviation":"JUSIFO (Jurnal Sistem Informasi)","page":"117-126","title":"Comparative Analysis of Naïve Bayes Classifier and Support Vector Machine for Multilingual Sentiment Analysis: Insights from Genshin Impact User Reviews","volume":"10","author":[{"family":"Aprinastya","given":"Rachell"},{"family":"Jazman","given":"Muhammad"},{"family":"Syaifullah","given":"Syaifullah"},{"family":"Rahmawita","given":"Medyantiwi"},{"family":"Siregar","given":"Syafril"},{"family":"Saputra","given":"Eki"}],"issued":{"date-parts":[["2024"]]}},"suppress-author":true}],"schema":"https://github.com/citation-style-language/schema/raw/master/csl-citation.json"} </w:instrText>
+      </w:r>
+      <w:r>
+        <w:fldChar w:fldCharType="separate"/>
+      </w:r>
+      <w:r>
+        <w:rPr>
+          <w:rFonts w:ascii="Aptos" w:hAnsi="Aptos"/>
+        </w:rPr>
+        <w:t>(2024)</w:t>
+      </w:r>
+      <w:r>
+        <w:fldChar w:fldCharType="end"/>
+      </w:r>
+      <w:r>
+        <w:t xml:space="preserve"> demonstrate that algorithm performance varies by dataset and language, justifying the use of both NBC and SVM in this project for comparison purposes.</w:t>
       </w:r>
     </w:p>
     <w:p/>
-    <w:p>
-      <w:r>
-        <w:t>Paragraph 2 — what they found, and one sentence explaining why this is relevant to your project (~75 words)</w:t>
-      </w:r>
-    </w:p>
     <w:sectPr>
       <w:pgSz w:w="12240" w:h="15840"/>
       <w:pgMar w:top="1440" w:right="1440" w:bottom="1440" w:left="1440" w:header="720" w:footer="720" w:gutter="0"/>
@@ -254,6 +380,554 @@
     </w:sectPr>
   </w:body>
 </w:document>
+</file>
+
+<file path=word/numbering.xml><?xml version="1.0" encoding="utf-8"?>
+<w:numbering xmlns:wpc="http://schemas.microsoft.com/office/word/2010/wordprocessingCanvas" xmlns:cx="http://schemas.microsoft.com/office/drawing/2014/chartex" xmlns:cx1="http://schemas.microsoft.com/office/drawing/2015/9/8/chartex" xmlns:cx2="http://schemas.microsoft.com/office/drawing/2015/10/21/chartex" xmlns:cx3="http://schemas.microsoft.com/office/drawing/2016/5/9/chartex" xmlns:cx4="http://schemas.microsoft.com/office/drawing/2016/5/10/chartex" xmlns:cx5="http://schemas.microsoft.com/office/drawing/2016/5/11/chartex" xmlns:cx6="http://schemas.microsoft.com/office/drawing/2016/5/12/chartex" xmlns:cx7="http://schemas.microsoft.com/office/drawing/2016/5/13/chartex" xmlns:cx8="http://schemas.microsoft.com/office/drawing/2016/5/14/chartex" xmlns:mc="http://schemas.openxmlformats.org/markup-compatibility/2006" xmlns:aink="http://schemas.microsoft.com/office/drawing/2016/ink" xmlns:am3d="http://schemas.microsoft.com/office/drawing/2017/model3d" xmlns:o="urn:schemas-microsoft-com:office:office" xmlns:oel="http://schemas.microsoft.com/office/2019/extlst" xmlns:r="http://schemas.openxmlformats.org/officeDocument/2006/relationships" xmlns:m="http://schemas.openxmlformats.org/officeDocument/2006/math" xmlns:v="urn:schemas-microsoft-com:vml" xmlns:wp14="http://schemas.microsoft.com/office/word/2010/wordprocessingDrawing" xmlns:wp="http://schemas.openxmlformats.org/drawingml/2006/wordprocessingDrawing" xmlns:w10="urn:schemas-microsoft-com:office:word" xmlns:w="http://schemas.openxmlformats.org/wordprocessingml/2006/main" xmlns:w14="http://schemas.microsoft.com/office/word/2010/wordml" xmlns:w15="http://schemas.microsoft.com/office/word/2012/wordml" xmlns:w16cex="http://schemas.microsoft.com/office/word/2018/wordml/cex" xmlns:w16cid="http://schemas.microsoft.com/office/word/2016/wordml/cid" xmlns:w16="http://schemas.microsoft.com/office/word/2018/wordml" xmlns:w16du="http://schemas.microsoft.com/office/word/2023/wordml/word16du" xmlns:w16sdtdh="http://schemas.microsoft.com/office/word/2020/wordml/sdtdatahash" xmlns:w16sdtfl="http://schemas.microsoft.com/office/word/2024/wordml/sdtformatlock" xmlns:w16se="http://schemas.microsoft.com/office/word/2015/wordml/symex" xmlns:wpg="http://schemas.microsoft.com/office/word/2010/wordprocessingGroup" xmlns:wpi="http://schemas.microsoft.com/office/word/2010/wordprocessingInk" xmlns:wne="http://schemas.microsoft.com/office/word/2006/wordml" xmlns:wps="http://schemas.microsoft.com/office/word/2010/wordprocessingShape" mc:Ignorable="w14 w15 w16se w16cid w16 w16cex w16sdtdh w16sdtfl w16du wp14">
+  <w:abstractNum w:abstractNumId="0" w15:restartNumberingAfterBreak="0">
+    <w:nsid w:val="10414E5D"/>
+    <w:multiLevelType w:val="hybridMultilevel"/>
+    <w:tmpl w:val="1CDC7EE6"/>
+    <w:lvl w:ilvl="0" w:tplc="0809000F">
+      <w:start w:val="1"/>
+      <w:numFmt w:val="decimal"/>
+      <w:lvlText w:val="%1."/>
+      <w:lvlJc w:val="left"/>
+      <w:pPr>
+        <w:ind w:left="720" w:hanging="360"/>
+      </w:pPr>
+    </w:lvl>
+    <w:lvl w:ilvl="1" w:tplc="08090019">
+      <w:start w:val="1"/>
+      <w:numFmt w:val="lowerLetter"/>
+      <w:lvlText w:val="%2."/>
+      <w:lvlJc w:val="left"/>
+      <w:pPr>
+        <w:ind w:left="1440" w:hanging="360"/>
+      </w:pPr>
+    </w:lvl>
+    <w:lvl w:ilvl="2" w:tplc="0809001B" w:tentative="1">
+      <w:start w:val="1"/>
+      <w:numFmt w:val="lowerRoman"/>
+      <w:lvlText w:val="%3."/>
+      <w:lvlJc w:val="right"/>
+      <w:pPr>
+        <w:ind w:left="2160" w:hanging="180"/>
+      </w:pPr>
+    </w:lvl>
+    <w:lvl w:ilvl="3" w:tplc="0809000F" w:tentative="1">
+      <w:start w:val="1"/>
+      <w:numFmt w:val="decimal"/>
+      <w:lvlText w:val="%4."/>
+      <w:lvlJc w:val="left"/>
+      <w:pPr>
+        <w:ind w:left="2880" w:hanging="360"/>
+      </w:pPr>
+    </w:lvl>
+    <w:lvl w:ilvl="4" w:tplc="08090019" w:tentative="1">
+      <w:start w:val="1"/>
+      <w:numFmt w:val="lowerLetter"/>
+      <w:lvlText w:val="%5."/>
+      <w:lvlJc w:val="left"/>
+      <w:pPr>
+        <w:ind w:left="3600" w:hanging="360"/>
+      </w:pPr>
+    </w:lvl>
+    <w:lvl w:ilvl="5" w:tplc="0809001B" w:tentative="1">
+      <w:start w:val="1"/>
+      <w:numFmt w:val="lowerRoman"/>
+      <w:lvlText w:val="%6."/>
+      <w:lvlJc w:val="right"/>
+      <w:pPr>
+        <w:ind w:left="4320" w:hanging="180"/>
+      </w:pPr>
+    </w:lvl>
+    <w:lvl w:ilvl="6" w:tplc="0809000F" w:tentative="1">
+      <w:start w:val="1"/>
+      <w:numFmt w:val="decimal"/>
+      <w:lvlText w:val="%7."/>
+      <w:lvlJc w:val="left"/>
+      <w:pPr>
+        <w:ind w:left="5040" w:hanging="360"/>
+      </w:pPr>
+    </w:lvl>
+    <w:lvl w:ilvl="7" w:tplc="08090019" w:tentative="1">
+      <w:start w:val="1"/>
+      <w:numFmt w:val="lowerLetter"/>
+      <w:lvlText w:val="%8."/>
+      <w:lvlJc w:val="left"/>
+      <w:pPr>
+        <w:ind w:left="5760" w:hanging="360"/>
+      </w:pPr>
+    </w:lvl>
+    <w:lvl w:ilvl="8" w:tplc="0809001B" w:tentative="1">
+      <w:start w:val="1"/>
+      <w:numFmt w:val="lowerRoman"/>
+      <w:lvlText w:val="%9."/>
+      <w:lvlJc w:val="right"/>
+      <w:pPr>
+        <w:ind w:left="6480" w:hanging="180"/>
+      </w:pPr>
+    </w:lvl>
+  </w:abstractNum>
+  <w:abstractNum w:abstractNumId="1" w15:restartNumberingAfterBreak="0">
+    <w:nsid w:val="26275F9D"/>
+    <w:multiLevelType w:val="hybridMultilevel"/>
+    <w:tmpl w:val="CE38C0D2"/>
+    <w:lvl w:ilvl="0" w:tplc="1444DF7C">
+      <w:start w:val="1"/>
+      <w:numFmt w:val="decimal"/>
+      <w:lvlText w:val="%1."/>
+      <w:lvlJc w:val="left"/>
+      <w:pPr>
+        <w:ind w:left="850" w:hanging="490"/>
+      </w:pPr>
+      <w:rPr>
+        <w:rFonts w:hint="default"/>
+      </w:rPr>
+    </w:lvl>
+    <w:lvl w:ilvl="1" w:tplc="08090019" w:tentative="1">
+      <w:start w:val="1"/>
+      <w:numFmt w:val="lowerLetter"/>
+      <w:lvlText w:val="%2."/>
+      <w:lvlJc w:val="left"/>
+      <w:pPr>
+        <w:ind w:left="1440" w:hanging="360"/>
+      </w:pPr>
+    </w:lvl>
+    <w:lvl w:ilvl="2" w:tplc="0809001B" w:tentative="1">
+      <w:start w:val="1"/>
+      <w:numFmt w:val="lowerRoman"/>
+      <w:lvlText w:val="%3."/>
+      <w:lvlJc w:val="right"/>
+      <w:pPr>
+        <w:ind w:left="2160" w:hanging="180"/>
+      </w:pPr>
+    </w:lvl>
+    <w:lvl w:ilvl="3" w:tplc="0809000F" w:tentative="1">
+      <w:start w:val="1"/>
+      <w:numFmt w:val="decimal"/>
+      <w:lvlText w:val="%4."/>
+      <w:lvlJc w:val="left"/>
+      <w:pPr>
+        <w:ind w:left="2880" w:hanging="360"/>
+      </w:pPr>
+    </w:lvl>
+    <w:lvl w:ilvl="4" w:tplc="08090019" w:tentative="1">
+      <w:start w:val="1"/>
+      <w:numFmt w:val="lowerLetter"/>
+      <w:lvlText w:val="%5."/>
+      <w:lvlJc w:val="left"/>
+      <w:pPr>
+        <w:ind w:left="3600" w:hanging="360"/>
+      </w:pPr>
+    </w:lvl>
+    <w:lvl w:ilvl="5" w:tplc="0809001B" w:tentative="1">
+      <w:start w:val="1"/>
+      <w:numFmt w:val="lowerRoman"/>
+      <w:lvlText w:val="%6."/>
+      <w:lvlJc w:val="right"/>
+      <w:pPr>
+        <w:ind w:left="4320" w:hanging="180"/>
+      </w:pPr>
+    </w:lvl>
+    <w:lvl w:ilvl="6" w:tplc="0809000F" w:tentative="1">
+      <w:start w:val="1"/>
+      <w:numFmt w:val="decimal"/>
+      <w:lvlText w:val="%7."/>
+      <w:lvlJc w:val="left"/>
+      <w:pPr>
+        <w:ind w:left="5040" w:hanging="360"/>
+      </w:pPr>
+    </w:lvl>
+    <w:lvl w:ilvl="7" w:tplc="08090019" w:tentative="1">
+      <w:start w:val="1"/>
+      <w:numFmt w:val="lowerLetter"/>
+      <w:lvlText w:val="%8."/>
+      <w:lvlJc w:val="left"/>
+      <w:pPr>
+        <w:ind w:left="5760" w:hanging="360"/>
+      </w:pPr>
+    </w:lvl>
+    <w:lvl w:ilvl="8" w:tplc="0809001B" w:tentative="1">
+      <w:start w:val="1"/>
+      <w:numFmt w:val="lowerRoman"/>
+      <w:lvlText w:val="%9."/>
+      <w:lvlJc w:val="right"/>
+      <w:pPr>
+        <w:ind w:left="6480" w:hanging="180"/>
+      </w:pPr>
+    </w:lvl>
+  </w:abstractNum>
+  <w:abstractNum w:abstractNumId="2" w15:restartNumberingAfterBreak="0">
+    <w:nsid w:val="48A231BD"/>
+    <w:multiLevelType w:val="hybridMultilevel"/>
+    <w:tmpl w:val="D7824F36"/>
+    <w:lvl w:ilvl="0" w:tplc="0809000F">
+      <w:start w:val="1"/>
+      <w:numFmt w:val="decimal"/>
+      <w:lvlText w:val="%1."/>
+      <w:lvlJc w:val="left"/>
+      <w:pPr>
+        <w:ind w:left="720" w:hanging="360"/>
+      </w:pPr>
+    </w:lvl>
+    <w:lvl w:ilvl="1" w:tplc="08090019">
+      <w:start w:val="1"/>
+      <w:numFmt w:val="lowerLetter"/>
+      <w:lvlText w:val="%2."/>
+      <w:lvlJc w:val="left"/>
+      <w:pPr>
+        <w:ind w:left="1440" w:hanging="360"/>
+      </w:pPr>
+    </w:lvl>
+    <w:lvl w:ilvl="2" w:tplc="0809001B" w:tentative="1">
+      <w:start w:val="1"/>
+      <w:numFmt w:val="lowerRoman"/>
+      <w:lvlText w:val="%3."/>
+      <w:lvlJc w:val="right"/>
+      <w:pPr>
+        <w:ind w:left="2160" w:hanging="180"/>
+      </w:pPr>
+    </w:lvl>
+    <w:lvl w:ilvl="3" w:tplc="0809000F" w:tentative="1">
+      <w:start w:val="1"/>
+      <w:numFmt w:val="decimal"/>
+      <w:lvlText w:val="%4."/>
+      <w:lvlJc w:val="left"/>
+      <w:pPr>
+        <w:ind w:left="2880" w:hanging="360"/>
+      </w:pPr>
+    </w:lvl>
+    <w:lvl w:ilvl="4" w:tplc="08090019" w:tentative="1">
+      <w:start w:val="1"/>
+      <w:numFmt w:val="lowerLetter"/>
+      <w:lvlText w:val="%5."/>
+      <w:lvlJc w:val="left"/>
+      <w:pPr>
+        <w:ind w:left="3600" w:hanging="360"/>
+      </w:pPr>
+    </w:lvl>
+    <w:lvl w:ilvl="5" w:tplc="0809001B" w:tentative="1">
+      <w:start w:val="1"/>
+      <w:numFmt w:val="lowerRoman"/>
+      <w:lvlText w:val="%6."/>
+      <w:lvlJc w:val="right"/>
+      <w:pPr>
+        <w:ind w:left="4320" w:hanging="180"/>
+      </w:pPr>
+    </w:lvl>
+    <w:lvl w:ilvl="6" w:tplc="0809000F" w:tentative="1">
+      <w:start w:val="1"/>
+      <w:numFmt w:val="decimal"/>
+      <w:lvlText w:val="%7."/>
+      <w:lvlJc w:val="left"/>
+      <w:pPr>
+        <w:ind w:left="5040" w:hanging="360"/>
+      </w:pPr>
+    </w:lvl>
+    <w:lvl w:ilvl="7" w:tplc="08090019" w:tentative="1">
+      <w:start w:val="1"/>
+      <w:numFmt w:val="lowerLetter"/>
+      <w:lvlText w:val="%8."/>
+      <w:lvlJc w:val="left"/>
+      <w:pPr>
+        <w:ind w:left="5760" w:hanging="360"/>
+      </w:pPr>
+    </w:lvl>
+    <w:lvl w:ilvl="8" w:tplc="0809001B" w:tentative="1">
+      <w:start w:val="1"/>
+      <w:numFmt w:val="lowerRoman"/>
+      <w:lvlText w:val="%9."/>
+      <w:lvlJc w:val="right"/>
+      <w:pPr>
+        <w:ind w:left="6480" w:hanging="180"/>
+      </w:pPr>
+    </w:lvl>
+  </w:abstractNum>
+  <w:abstractNum w:abstractNumId="3" w15:restartNumberingAfterBreak="0">
+    <w:nsid w:val="4AFC7CE7"/>
+    <w:multiLevelType w:val="hybridMultilevel"/>
+    <w:tmpl w:val="E342083C"/>
+    <w:lvl w:ilvl="0" w:tplc="0809000F">
+      <w:start w:val="1"/>
+      <w:numFmt w:val="decimal"/>
+      <w:lvlText w:val="%1."/>
+      <w:lvlJc w:val="left"/>
+      <w:pPr>
+        <w:ind w:left="720" w:hanging="360"/>
+      </w:pPr>
+      <w:rPr>
+        <w:rFonts w:hint="default"/>
+      </w:rPr>
+    </w:lvl>
+    <w:lvl w:ilvl="1" w:tplc="08090019" w:tentative="1">
+      <w:start w:val="1"/>
+      <w:numFmt w:val="lowerLetter"/>
+      <w:lvlText w:val="%2."/>
+      <w:lvlJc w:val="left"/>
+      <w:pPr>
+        <w:ind w:left="1440" w:hanging="360"/>
+      </w:pPr>
+    </w:lvl>
+    <w:lvl w:ilvl="2" w:tplc="0809001B" w:tentative="1">
+      <w:start w:val="1"/>
+      <w:numFmt w:val="lowerRoman"/>
+      <w:lvlText w:val="%3."/>
+      <w:lvlJc w:val="right"/>
+      <w:pPr>
+        <w:ind w:left="2160" w:hanging="180"/>
+      </w:pPr>
+    </w:lvl>
+    <w:lvl w:ilvl="3" w:tplc="0809000F" w:tentative="1">
+      <w:start w:val="1"/>
+      <w:numFmt w:val="decimal"/>
+      <w:lvlText w:val="%4."/>
+      <w:lvlJc w:val="left"/>
+      <w:pPr>
+        <w:ind w:left="2880" w:hanging="360"/>
+      </w:pPr>
+    </w:lvl>
+    <w:lvl w:ilvl="4" w:tplc="08090019" w:tentative="1">
+      <w:start w:val="1"/>
+      <w:numFmt w:val="lowerLetter"/>
+      <w:lvlText w:val="%5."/>
+      <w:lvlJc w:val="left"/>
+      <w:pPr>
+        <w:ind w:left="3600" w:hanging="360"/>
+      </w:pPr>
+    </w:lvl>
+    <w:lvl w:ilvl="5" w:tplc="0809001B" w:tentative="1">
+      <w:start w:val="1"/>
+      <w:numFmt w:val="lowerRoman"/>
+      <w:lvlText w:val="%6."/>
+      <w:lvlJc w:val="right"/>
+      <w:pPr>
+        <w:ind w:left="4320" w:hanging="180"/>
+      </w:pPr>
+    </w:lvl>
+    <w:lvl w:ilvl="6" w:tplc="0809000F" w:tentative="1">
+      <w:start w:val="1"/>
+      <w:numFmt w:val="decimal"/>
+      <w:lvlText w:val="%7."/>
+      <w:lvlJc w:val="left"/>
+      <w:pPr>
+        <w:ind w:left="5040" w:hanging="360"/>
+      </w:pPr>
+    </w:lvl>
+    <w:lvl w:ilvl="7" w:tplc="08090019" w:tentative="1">
+      <w:start w:val="1"/>
+      <w:numFmt w:val="lowerLetter"/>
+      <w:lvlText w:val="%8."/>
+      <w:lvlJc w:val="left"/>
+      <w:pPr>
+        <w:ind w:left="5760" w:hanging="360"/>
+      </w:pPr>
+    </w:lvl>
+    <w:lvl w:ilvl="8" w:tplc="0809001B" w:tentative="1">
+      <w:start w:val="1"/>
+      <w:numFmt w:val="lowerRoman"/>
+      <w:lvlText w:val="%9."/>
+      <w:lvlJc w:val="right"/>
+      <w:pPr>
+        <w:ind w:left="6480" w:hanging="180"/>
+      </w:pPr>
+    </w:lvl>
+  </w:abstractNum>
+  <w:abstractNum w:abstractNumId="4" w15:restartNumberingAfterBreak="0">
+    <w:nsid w:val="4C5B084A"/>
+    <w:multiLevelType w:val="hybridMultilevel"/>
+    <w:tmpl w:val="80ACB974"/>
+    <w:lvl w:ilvl="0" w:tplc="08090019">
+      <w:start w:val="1"/>
+      <w:numFmt w:val="lowerLetter"/>
+      <w:lvlText w:val="%1."/>
+      <w:lvlJc w:val="left"/>
+      <w:pPr>
+        <w:ind w:left="720" w:hanging="360"/>
+      </w:pPr>
+    </w:lvl>
+    <w:lvl w:ilvl="1" w:tplc="08090019" w:tentative="1">
+      <w:start w:val="1"/>
+      <w:numFmt w:val="lowerLetter"/>
+      <w:lvlText w:val="%2."/>
+      <w:lvlJc w:val="left"/>
+      <w:pPr>
+        <w:ind w:left="1440" w:hanging="360"/>
+      </w:pPr>
+    </w:lvl>
+    <w:lvl w:ilvl="2" w:tplc="0809001B" w:tentative="1">
+      <w:start w:val="1"/>
+      <w:numFmt w:val="lowerRoman"/>
+      <w:lvlText w:val="%3."/>
+      <w:lvlJc w:val="right"/>
+      <w:pPr>
+        <w:ind w:left="2160" w:hanging="180"/>
+      </w:pPr>
+    </w:lvl>
+    <w:lvl w:ilvl="3" w:tplc="0809000F" w:tentative="1">
+      <w:start w:val="1"/>
+      <w:numFmt w:val="decimal"/>
+      <w:lvlText w:val="%4."/>
+      <w:lvlJc w:val="left"/>
+      <w:pPr>
+        <w:ind w:left="2880" w:hanging="360"/>
+      </w:pPr>
+    </w:lvl>
+    <w:lvl w:ilvl="4" w:tplc="08090019" w:tentative="1">
+      <w:start w:val="1"/>
+      <w:numFmt w:val="lowerLetter"/>
+      <w:lvlText w:val="%5."/>
+      <w:lvlJc w:val="left"/>
+      <w:pPr>
+        <w:ind w:left="3600" w:hanging="360"/>
+      </w:pPr>
+    </w:lvl>
+    <w:lvl w:ilvl="5" w:tplc="0809001B" w:tentative="1">
+      <w:start w:val="1"/>
+      <w:numFmt w:val="lowerRoman"/>
+      <w:lvlText w:val="%6."/>
+      <w:lvlJc w:val="right"/>
+      <w:pPr>
+        <w:ind w:left="4320" w:hanging="180"/>
+      </w:pPr>
+    </w:lvl>
+    <w:lvl w:ilvl="6" w:tplc="0809000F" w:tentative="1">
+      <w:start w:val="1"/>
+      <w:numFmt w:val="decimal"/>
+      <w:lvlText w:val="%7."/>
+      <w:lvlJc w:val="left"/>
+      <w:pPr>
+        <w:ind w:left="5040" w:hanging="360"/>
+      </w:pPr>
+    </w:lvl>
+    <w:lvl w:ilvl="7" w:tplc="08090019" w:tentative="1">
+      <w:start w:val="1"/>
+      <w:numFmt w:val="lowerLetter"/>
+      <w:lvlText w:val="%8."/>
+      <w:lvlJc w:val="left"/>
+      <w:pPr>
+        <w:ind w:left="5760" w:hanging="360"/>
+      </w:pPr>
+    </w:lvl>
+    <w:lvl w:ilvl="8" w:tplc="0809001B" w:tentative="1">
+      <w:start w:val="1"/>
+      <w:numFmt w:val="lowerRoman"/>
+      <w:lvlText w:val="%9."/>
+      <w:lvlJc w:val="right"/>
+      <w:pPr>
+        <w:ind w:left="6480" w:hanging="180"/>
+      </w:pPr>
+    </w:lvl>
+  </w:abstractNum>
+  <w:abstractNum w:abstractNumId="5" w15:restartNumberingAfterBreak="0">
+    <w:nsid w:val="705D6E35"/>
+    <w:multiLevelType w:val="hybridMultilevel"/>
+    <w:tmpl w:val="54349EC0"/>
+    <w:lvl w:ilvl="0" w:tplc="1444DF7C">
+      <w:start w:val="1"/>
+      <w:numFmt w:val="decimal"/>
+      <w:lvlText w:val="%1."/>
+      <w:lvlJc w:val="left"/>
+      <w:pPr>
+        <w:ind w:left="850" w:hanging="490"/>
+      </w:pPr>
+      <w:rPr>
+        <w:rFonts w:hint="default"/>
+      </w:rPr>
+    </w:lvl>
+    <w:lvl w:ilvl="1" w:tplc="08090019">
+      <w:start w:val="1"/>
+      <w:numFmt w:val="lowerLetter"/>
+      <w:lvlText w:val="%2."/>
+      <w:lvlJc w:val="left"/>
+      <w:pPr>
+        <w:ind w:left="1440" w:hanging="360"/>
+      </w:pPr>
+    </w:lvl>
+    <w:lvl w:ilvl="2" w:tplc="0809001B" w:tentative="1">
+      <w:start w:val="1"/>
+      <w:numFmt w:val="lowerRoman"/>
+      <w:lvlText w:val="%3."/>
+      <w:lvlJc w:val="right"/>
+      <w:pPr>
+        <w:ind w:left="2160" w:hanging="180"/>
+      </w:pPr>
+    </w:lvl>
+    <w:lvl w:ilvl="3" w:tplc="0809000F" w:tentative="1">
+      <w:start w:val="1"/>
+      <w:numFmt w:val="decimal"/>
+      <w:lvlText w:val="%4."/>
+      <w:lvlJc w:val="left"/>
+      <w:pPr>
+        <w:ind w:left="2880" w:hanging="360"/>
+      </w:pPr>
+    </w:lvl>
+    <w:lvl w:ilvl="4" w:tplc="08090019" w:tentative="1">
+      <w:start w:val="1"/>
+      <w:numFmt w:val="lowerLetter"/>
+      <w:lvlText w:val="%5."/>
+      <w:lvlJc w:val="left"/>
+      <w:pPr>
+        <w:ind w:left="3600" w:hanging="360"/>
+      </w:pPr>
+    </w:lvl>
+    <w:lvl w:ilvl="5" w:tplc="0809001B" w:tentative="1">
+      <w:start w:val="1"/>
+      <w:numFmt w:val="lowerRoman"/>
+      <w:lvlText w:val="%6."/>
+      <w:lvlJc w:val="right"/>
+      <w:pPr>
+        <w:ind w:left="4320" w:hanging="180"/>
+      </w:pPr>
+    </w:lvl>
+    <w:lvl w:ilvl="6" w:tplc="0809000F" w:tentative="1">
+      <w:start w:val="1"/>
+      <w:numFmt w:val="decimal"/>
+      <w:lvlText w:val="%7."/>
+      <w:lvlJc w:val="left"/>
+      <w:pPr>
+        <w:ind w:left="5040" w:hanging="360"/>
+      </w:pPr>
+    </w:lvl>
+    <w:lvl w:ilvl="7" w:tplc="08090019" w:tentative="1">
+      <w:start w:val="1"/>
+      <w:numFmt w:val="lowerLetter"/>
+      <w:lvlText w:val="%8."/>
+      <w:lvlJc w:val="left"/>
+      <w:pPr>
+        <w:ind w:left="5760" w:hanging="360"/>
+      </w:pPr>
+    </w:lvl>
+    <w:lvl w:ilvl="8" w:tplc="0809001B" w:tentative="1">
+      <w:start w:val="1"/>
+      <w:numFmt w:val="lowerRoman"/>
+      <w:lvlText w:val="%9."/>
+      <w:lvlJc w:val="right"/>
+      <w:pPr>
+        <w:ind w:left="6480" w:hanging="180"/>
+      </w:pPr>
+    </w:lvl>
+  </w:abstractNum>
+  <w:num w:numId="1" w16cid:durableId="474641263">
+    <w:abstractNumId w:val="2"/>
+  </w:num>
+  <w:num w:numId="2" w16cid:durableId="654842933">
+    <w:abstractNumId w:val="4"/>
+  </w:num>
+  <w:num w:numId="3" w16cid:durableId="1886599001">
+    <w:abstractNumId w:val="5"/>
+  </w:num>
+  <w:num w:numId="4" w16cid:durableId="1856723347">
+    <w:abstractNumId w:val="1"/>
+  </w:num>
+  <w:num w:numId="5" w16cid:durableId="1412046442">
+    <w:abstractNumId w:val="3"/>
+  </w:num>
+  <w:num w:numId="6" w16cid:durableId="1578245845">
+    <w:abstractNumId w:val="0"/>
+  </w:num>
+</w:numbering>
 </file>
 
 <file path=word/styles.xml><?xml version="1.0" encoding="utf-8"?>

</xml_diff>